<commit_message>
added week 2 day-2
</commit_message>
<xml_diff>
--- a/Week-2/Day-1/LAB-1.docx
+++ b/Week-2/Day-1/LAB-1.docx
@@ -30,7 +30,7 @@
           <w:lang w:val="en-IN"/>
         </w:rPr>
         <w:pict w14:anchorId="7D915881">
-          <v:rect id="_x0000_i1223" style="width:0;height:1.5pt" o:hralign="center" o:hrstd="t" o:hr="t" fillcolor="#a0a0a0" stroked="f"/>
+          <v:rect id="_x0000_i1025" style="width:0;height:1.5pt" o:hralign="center" o:hrstd="t" o:hr="t" fillcolor="#a0a0a0" stroked="f"/>
         </w:pict>
       </w:r>
     </w:p>
@@ -109,21 +109,7 @@
         <w:rPr>
           <w:lang w:val="en-IN"/>
         </w:rPr>
-        <w:t xml:space="preserve">Local LLM (Llama3 via </w:t>
-      </w:r>
-      <w:proofErr w:type="spellStart"/>
-      <w:r>
-        <w:rPr>
-          <w:lang w:val="en-IN"/>
-        </w:rPr>
-        <w:t>Ollama</w:t>
-      </w:r>
-      <w:proofErr w:type="spellEnd"/>
-      <w:r>
-        <w:rPr>
-          <w:lang w:val="en-IN"/>
-        </w:rPr>
-        <w:t xml:space="preserve">) decides SQL </w:t>
+        <w:t xml:space="preserve">Local LLM (Llama3 via Ollama) decides SQL </w:t>
       </w:r>
     </w:p>
     <w:p>
@@ -171,7 +157,7 @@
           <w:lang w:val="en-IN"/>
         </w:rPr>
         <w:pict w14:anchorId="4BFD4798">
-          <v:rect id="_x0000_i1224" style="width:0;height:1.5pt" o:hralign="center" o:hrstd="t" o:hr="t" fillcolor="#a0a0a0" stroked="f"/>
+          <v:rect id="_x0000_i1026" style="width:0;height:1.5pt" o:hralign="center" o:hrstd="t" o:hr="t" fillcolor="#a0a0a0" stroked="f"/>
         </w:pict>
       </w:r>
     </w:p>
@@ -209,42 +195,14 @@
           <w:lang w:val="en-IN"/>
         </w:rPr>
         <w:br/>
-        <w:t xml:space="preserve">     → Local LLM (</w:t>
-      </w:r>
-      <w:proofErr w:type="spellStart"/>
-      <w:r>
-        <w:rPr>
-          <w:lang w:val="en-IN"/>
-        </w:rPr>
-        <w:t>Ollama</w:t>
-      </w:r>
-      <w:proofErr w:type="spellEnd"/>
-      <w:r>
-        <w:rPr>
-          <w:lang w:val="en-IN"/>
-        </w:rPr>
-        <w:t xml:space="preserve"> - Llama3)</w:t>
-      </w:r>
-      <w:r>
-        <w:rPr>
-          <w:lang w:val="en-IN"/>
-        </w:rPr>
-        <w:br/>
-        <w:t xml:space="preserve">     → MCP Server (</w:t>
-      </w:r>
-      <w:proofErr w:type="spellStart"/>
-      <w:r>
-        <w:rPr>
-          <w:lang w:val="en-IN"/>
-        </w:rPr>
-        <w:t>FastAPI</w:t>
-      </w:r>
-      <w:proofErr w:type="spellEnd"/>
-      <w:r>
-        <w:rPr>
-          <w:lang w:val="en-IN"/>
-        </w:rPr>
-        <w:t>)</w:t>
+        <w:t xml:space="preserve">     → Local LLM (Ollama - Llama3)</w:t>
+      </w:r>
+      <w:r>
+        <w:rPr>
+          <w:lang w:val="en-IN"/>
+        </w:rPr>
+        <w:br/>
+        <w:t xml:space="preserve">     → MCP Server (FastAPI)</w:t>
       </w:r>
       <w:r>
         <w:rPr>
@@ -272,7 +230,7 @@
           <w:lang w:val="en-IN"/>
         </w:rPr>
         <w:pict w14:anchorId="4EB08070">
-          <v:rect id="_x0000_i1225" style="width:0;height:1.5pt" o:hralign="center" o:hrstd="t" o:hr="t" fillcolor="#a0a0a0" stroked="f"/>
+          <v:rect id="_x0000_i1027" style="width:0;height:1.5pt" o:hralign="center" o:hrstd="t" o:hr="t" fillcolor="#a0a0a0" stroked="f"/>
         </w:pict>
       </w:r>
     </w:p>
@@ -304,7 +262,7 @@
           <w:lang w:val="en-IN"/>
         </w:rPr>
         <w:pict w14:anchorId="643C29F1">
-          <v:rect id="_x0000_i1226" style="width:0;height:1.5pt" o:hralign="center" o:hrstd="t" o:hr="t" fillcolor="#a0a0a0" stroked="f"/>
+          <v:rect id="_x0000_i1028" style="width:0;height:1.5pt" o:hralign="center" o:hrstd="t" o:hr="t" fillcolor="#a0a0a0" stroked="f"/>
         </w:pict>
       </w:r>
     </w:p>
@@ -339,53 +297,44 @@
           <w:bCs/>
           <w:lang w:val="en-IN"/>
         </w:rPr>
-        <w:t xml:space="preserve">1. Install </w:t>
-      </w:r>
-      <w:proofErr w:type="spellStart"/>
-      <w:r>
-        <w:rPr>
-          <w:b/>
-          <w:bCs/>
-          <w:lang w:val="en-IN"/>
-        </w:rPr>
-        <w:t>Ollama</w:t>
-      </w:r>
-      <w:proofErr w:type="spellEnd"/>
-    </w:p>
-    <w:p>
-      <w:pPr>
-        <w:rPr>
-          <w:lang w:val="en-IN"/>
-        </w:rPr>
-      </w:pPr>
-      <w:r>
-        <w:rPr>
-          <w:lang w:val="en-IN"/>
-        </w:rPr>
-        <w:t>curl -</w:t>
-      </w:r>
-      <w:proofErr w:type="spellStart"/>
-      <w:r>
-        <w:rPr>
-          <w:lang w:val="en-IN"/>
-        </w:rPr>
-        <w:t>fsSL</w:t>
-      </w:r>
-      <w:proofErr w:type="spellEnd"/>
-      <w:r>
-        <w:rPr>
-          <w:lang w:val="en-IN"/>
-        </w:rPr>
-        <w:t xml:space="preserve"> https://ollama.com/install.sh | </w:t>
-      </w:r>
-      <w:proofErr w:type="spellStart"/>
-      <w:r>
-        <w:rPr>
-          <w:lang w:val="en-IN"/>
-        </w:rPr>
-        <w:t>sh</w:t>
-      </w:r>
-      <w:proofErr w:type="spellEnd"/>
+        <w:t>1. Install Ollama</w:t>
+      </w:r>
+    </w:p>
+    <w:p>
+      <w:pPr>
+        <w:rPr>
+          <w:lang w:val="en-IN"/>
+        </w:rPr>
+      </w:pPr>
+      <w:r>
+        <w:rPr>
+          <w:lang w:val="en-IN"/>
+        </w:rPr>
+        <w:t>curl -fsSL https://ollama.com/install.sh | sh</w:t>
+      </w:r>
+    </w:p>
+    <w:p>
+      <w:pPr>
+        <w:rPr>
+          <w:lang w:val="en-IN"/>
+        </w:rPr>
+      </w:pPr>
+      <w:r>
+        <w:rPr>
+          <w:lang w:val="en-IN"/>
+        </w:rPr>
+        <w:t>OR</w:t>
+      </w:r>
+    </w:p>
+    <w:p>
+      <w:pPr>
+        <w:rPr>
+          <w:lang w:val="en-IN"/>
+        </w:rPr>
+      </w:pPr>
+      <w:r>
+        <w:t>winget install Ollama.Ollama</w:t>
+      </w:r>
     </w:p>
     <w:p>
       <w:pPr>
@@ -406,19 +355,11 @@
           <w:lang w:val="en-IN"/>
         </w:rPr>
       </w:pPr>
-      <w:proofErr w:type="spellStart"/>
-      <w:r>
-        <w:rPr>
-          <w:lang w:val="en-IN"/>
-        </w:rPr>
-        <w:t>ollama</w:t>
-      </w:r>
-      <w:proofErr w:type="spellEnd"/>
-      <w:r>
-        <w:rPr>
-          <w:lang w:val="en-IN"/>
-        </w:rPr>
-        <w:t xml:space="preserve"> run llama3</w:t>
+      <w:r>
+        <w:rPr>
+          <w:lang w:val="en-IN"/>
+        </w:rPr>
+        <w:t>ollama run llama3</w:t>
       </w:r>
     </w:p>
     <w:p>
@@ -432,7 +373,7 @@
           <w:lang w:val="en-IN"/>
         </w:rPr>
         <w:pict w14:anchorId="7321F9E9">
-          <v:rect id="_x0000_i1227" style="width:0;height:1.5pt" o:hralign="center" o:hrstd="t" o:hr="t" fillcolor="#a0a0a0" stroked="f"/>
+          <v:rect id="_x0000_i1029" style="width:0;height:1.5pt" o:hralign="center" o:hrstd="t" o:hr="t" fillcolor="#a0a0a0" stroked="f"/>
         </w:pict>
       </w:r>
     </w:p>
@@ -463,35 +404,8 @@
         <w:rPr>
           <w:lang w:val="en-IN"/>
         </w:rPr>
-        <w:t xml:space="preserve">pip install </w:t>
-      </w:r>
-      <w:proofErr w:type="spellStart"/>
-      <w:r>
-        <w:rPr>
-          <w:lang w:val="en-IN"/>
-        </w:rPr>
-        <w:t>fastapi</w:t>
-      </w:r>
-      <w:proofErr w:type="spellEnd"/>
-      <w:r>
-        <w:rPr>
-          <w:lang w:val="en-IN"/>
-        </w:rPr>
-        <w:t xml:space="preserve"> </w:t>
-      </w:r>
-      <w:proofErr w:type="spellStart"/>
-      <w:r>
-        <w:rPr>
-          <w:lang w:val="en-IN"/>
-        </w:rPr>
-        <w:t>uvicorn</w:t>
-      </w:r>
-      <w:proofErr w:type="spellEnd"/>
-      <w:r>
-        <w:rPr>
-          <w:lang w:val="en-IN"/>
-        </w:rPr>
-        <w:t xml:space="preserve"> snowflake-connector-python requests</w:t>
+        <w:lastRenderedPageBreak/>
+        <w:t>pip install fastapi uvicorn snowflake-connector-python requests</w:t>
       </w:r>
     </w:p>
     <w:p>
@@ -505,7 +419,7 @@
           <w:lang w:val="en-IN"/>
         </w:rPr>
         <w:pict w14:anchorId="797D470B">
-          <v:rect id="_x0000_i1228" style="width:0;height:1.5pt" o:hralign="center" o:hrstd="t" o:hr="t" fillcolor="#a0a0a0" stroked="f"/>
+          <v:rect id="_x0000_i1030" style="width:0;height:1.5pt" o:hralign="center" o:hrstd="t" o:hr="t" fillcolor="#a0a0a0" stroked="f"/>
         </w:pict>
       </w:r>
     </w:p>
@@ -523,7 +437,6 @@
           <w:bCs/>
           <w:lang w:val="en-IN"/>
         </w:rPr>
-        <w:lastRenderedPageBreak/>
         <w:t>3. Install VS Code Extensions</w:t>
       </w:r>
     </w:p>
@@ -580,7 +493,7 @@
           <w:lang w:val="en-IN"/>
         </w:rPr>
         <w:pict w14:anchorId="561B644F">
-          <v:rect id="_x0000_i1229" style="width:0;height:1.5pt" o:hralign="center" o:hrstd="t" o:hr="t" fillcolor="#a0a0a0" stroked="f"/>
+          <v:rect id="_x0000_i1031" style="width:0;height:1.5pt" o:hralign="center" o:hrstd="t" o:hr="t" fillcolor="#a0a0a0" stroked="f"/>
         </w:pict>
       </w:r>
     </w:p>
@@ -612,7 +525,7 @@
           <w:lang w:val="en-IN"/>
         </w:rPr>
         <w:pict w14:anchorId="73E41984">
-          <v:rect id="_x0000_i1230" style="width:0;height:1.5pt" o:hralign="center" o:hrstd="t" o:hr="t" fillcolor="#a0a0a0" stroked="f"/>
+          <v:rect id="_x0000_i1032" style="width:0;height:1.5pt" o:hralign="center" o:hrstd="t" o:hr="t" fillcolor="#a0a0a0" stroked="f"/>
         </w:pict>
       </w:r>
     </w:p>
@@ -643,21 +556,7 @@
         <w:rPr>
           <w:lang w:val="en-IN"/>
         </w:rPr>
-        <w:t xml:space="preserve">CREATE OR REPLACE TABLE </w:t>
-      </w:r>
-      <w:proofErr w:type="spellStart"/>
-      <w:r>
-        <w:rPr>
-          <w:lang w:val="en-IN"/>
-        </w:rPr>
-        <w:t>sales_data</w:t>
-      </w:r>
-      <w:proofErr w:type="spellEnd"/>
-      <w:r>
-        <w:rPr>
-          <w:lang w:val="en-IN"/>
-        </w:rPr>
-        <w:t xml:space="preserve"> (</w:t>
+        <w:t>CREATE OR REPLACE TABLE sales_data (</w:t>
       </w:r>
       <w:r>
         <w:rPr>
@@ -685,21 +584,7 @@
           <w:lang w:val="en-IN"/>
         </w:rPr>
         <w:br/>
-        <w:t xml:space="preserve">    </w:t>
-      </w:r>
-      <w:proofErr w:type="spellStart"/>
-      <w:r>
-        <w:rPr>
-          <w:lang w:val="en-IN"/>
-        </w:rPr>
-        <w:t>sale_date</w:t>
-      </w:r>
-      <w:proofErr w:type="spellEnd"/>
-      <w:r>
-        <w:rPr>
-          <w:lang w:val="en-IN"/>
-        </w:rPr>
-        <w:t xml:space="preserve"> DATE</w:t>
+        <w:t xml:space="preserve">    sale_date DATE</w:t>
       </w:r>
       <w:r>
         <w:rPr>
@@ -719,21 +604,7 @@
           <w:lang w:val="en-IN"/>
         </w:rPr>
         <w:br/>
-        <w:t xml:space="preserve">INSERT INTO </w:t>
-      </w:r>
-      <w:proofErr w:type="spellStart"/>
-      <w:r>
-        <w:rPr>
-          <w:lang w:val="en-IN"/>
-        </w:rPr>
-        <w:t>sales_data</w:t>
-      </w:r>
-      <w:proofErr w:type="spellEnd"/>
-      <w:r>
-        <w:rPr>
-          <w:lang w:val="en-IN"/>
-        </w:rPr>
-        <w:t xml:space="preserve"> VALUES</w:t>
+        <w:t>INSERT INTO sales_data VALUES</w:t>
       </w:r>
       <w:r>
         <w:rPr>
@@ -775,7 +646,7 @@
           <w:lang w:val="en-IN"/>
         </w:rPr>
         <w:pict w14:anchorId="10B3CF99">
-          <v:rect id="_x0000_i1231" style="width:0;height:1.5pt" o:hralign="center" o:hrstd="t" o:hr="t" fillcolor="#a0a0a0" stroked="f"/>
+          <v:rect id="_x0000_i1033" style="width:0;height:1.5pt" o:hralign="center" o:hrstd="t" o:hr="t" fillcolor="#a0a0a0" stroked="f"/>
         </w:pict>
       </w:r>
     </w:p>
@@ -807,7 +678,7 @@
           <w:lang w:val="en-IN"/>
         </w:rPr>
         <w:pict w14:anchorId="5D2FD0C2">
-          <v:rect id="_x0000_i1232" style="width:0;height:1.5pt" o:hralign="center" o:hrstd="t" o:hr="t" fillcolor="#a0a0a0" stroked="f"/>
+          <v:rect id="_x0000_i1034" style="width:0;height:1.5pt" o:hralign="center" o:hrstd="t" o:hr="t" fillcolor="#a0a0a0" stroked="f"/>
         </w:pict>
       </w:r>
     </w:p>
@@ -838,119 +709,47 @@
         <w:rPr>
           <w:lang w:val="en-IN"/>
         </w:rPr>
-        <w:t xml:space="preserve">from </w:t>
-      </w:r>
-      <w:proofErr w:type="spellStart"/>
-      <w:r>
-        <w:rPr>
-          <w:lang w:val="en-IN"/>
-        </w:rPr>
-        <w:t>fastapi</w:t>
-      </w:r>
-      <w:proofErr w:type="spellEnd"/>
-      <w:r>
-        <w:rPr>
-          <w:lang w:val="en-IN"/>
-        </w:rPr>
-        <w:t xml:space="preserve"> import </w:t>
-      </w:r>
-      <w:proofErr w:type="spellStart"/>
-      <w:r>
-        <w:rPr>
-          <w:lang w:val="en-IN"/>
-        </w:rPr>
-        <w:t>FastAPI</w:t>
-      </w:r>
-      <w:proofErr w:type="spellEnd"/>
-      <w:r>
-        <w:rPr>
-          <w:lang w:val="en-IN"/>
-        </w:rPr>
-        <w:br/>
-        <w:t xml:space="preserve">import </w:t>
-      </w:r>
-      <w:proofErr w:type="spellStart"/>
-      <w:r>
-        <w:rPr>
-          <w:lang w:val="en-IN"/>
-        </w:rPr>
-        <w:t>snowflake.connector</w:t>
-      </w:r>
-      <w:proofErr w:type="spellEnd"/>
-      <w:r>
-        <w:rPr>
-          <w:lang w:val="en-IN"/>
-        </w:rPr>
-        <w:br/>
-      </w:r>
-      <w:r>
-        <w:rPr>
-          <w:lang w:val="en-IN"/>
-        </w:rPr>
-        <w:br/>
-        <w:t xml:space="preserve">app = </w:t>
-      </w:r>
-      <w:proofErr w:type="spellStart"/>
-      <w:r>
-        <w:rPr>
-          <w:lang w:val="en-IN"/>
-        </w:rPr>
-        <w:t>FastAPI</w:t>
-      </w:r>
-      <w:proofErr w:type="spellEnd"/>
-      <w:r>
-        <w:rPr>
-          <w:lang w:val="en-IN"/>
-        </w:rPr>
-        <w:t>()</w:t>
-      </w:r>
-      <w:r>
-        <w:rPr>
-          <w:lang w:val="en-IN"/>
-        </w:rPr>
-        <w:br/>
-      </w:r>
-      <w:r>
-        <w:rPr>
-          <w:lang w:val="en-IN"/>
-        </w:rPr>
-        <w:br/>
-        <w:t xml:space="preserve">def </w:t>
-      </w:r>
-      <w:proofErr w:type="spellStart"/>
-      <w:r>
-        <w:rPr>
-          <w:lang w:val="en-IN"/>
-        </w:rPr>
-        <w:t>run_query</w:t>
-      </w:r>
-      <w:proofErr w:type="spellEnd"/>
-      <w:r>
-        <w:rPr>
-          <w:lang w:val="en-IN"/>
-        </w:rPr>
-        <w:t>(query):</w:t>
-      </w:r>
-      <w:r>
-        <w:rPr>
-          <w:lang w:val="en-IN"/>
-        </w:rPr>
-        <w:br/>
-        <w:t xml:space="preserve">    conn = </w:t>
-      </w:r>
-      <w:proofErr w:type="spellStart"/>
-      <w:r>
-        <w:rPr>
-          <w:lang w:val="en-IN"/>
-        </w:rPr>
-        <w:t>snowflake.connector.connect</w:t>
-      </w:r>
-      <w:proofErr w:type="spellEnd"/>
-      <w:r>
-        <w:rPr>
-          <w:lang w:val="en-IN"/>
-        </w:rPr>
-        <w:t>(</w:t>
+        <w:t>from fastapi import FastAPI</w:t>
+      </w:r>
+      <w:r>
+        <w:rPr>
+          <w:lang w:val="en-IN"/>
+        </w:rPr>
+        <w:br/>
+        <w:t>import snowflake.connector</w:t>
+      </w:r>
+      <w:r>
+        <w:rPr>
+          <w:lang w:val="en-IN"/>
+        </w:rPr>
+        <w:br/>
+      </w:r>
+      <w:r>
+        <w:rPr>
+          <w:lang w:val="en-IN"/>
+        </w:rPr>
+        <w:br/>
+        <w:t>app = FastAPI()</w:t>
+      </w:r>
+      <w:r>
+        <w:rPr>
+          <w:lang w:val="en-IN"/>
+        </w:rPr>
+        <w:br/>
+      </w:r>
+      <w:r>
+        <w:rPr>
+          <w:lang w:val="en-IN"/>
+        </w:rPr>
+        <w:br/>
+        <w:t>def run_query(query):</w:t>
+      </w:r>
+      <w:r>
+        <w:rPr>
+          <w:lang w:val="en-IN"/>
+        </w:rPr>
+        <w:br/>
+        <w:t xml:space="preserve">    conn = snowflake.connector.connect(</w:t>
       </w:r>
       <w:r>
         <w:rPr>
@@ -1012,111 +811,41 @@
           <w:lang w:val="en-IN"/>
         </w:rPr>
         <w:br/>
-        <w:t xml:space="preserve">    cursor = </w:t>
-      </w:r>
-      <w:proofErr w:type="spellStart"/>
-      <w:r>
-        <w:rPr>
-          <w:lang w:val="en-IN"/>
-        </w:rPr>
-        <w:t>conn.cursor</w:t>
-      </w:r>
-      <w:proofErr w:type="spellEnd"/>
-      <w:r>
-        <w:rPr>
-          <w:lang w:val="en-IN"/>
-        </w:rPr>
-        <w:t>()</w:t>
-      </w:r>
-      <w:r>
-        <w:rPr>
-          <w:lang w:val="en-IN"/>
-        </w:rPr>
-        <w:br/>
-        <w:t xml:space="preserve">    </w:t>
-      </w:r>
-      <w:proofErr w:type="spellStart"/>
-      <w:r>
-        <w:rPr>
-          <w:lang w:val="en-IN"/>
-        </w:rPr>
-        <w:t>cursor.execute</w:t>
-      </w:r>
-      <w:proofErr w:type="spellEnd"/>
-      <w:r>
-        <w:rPr>
-          <w:lang w:val="en-IN"/>
-        </w:rPr>
-        <w:t>(query)</w:t>
-      </w:r>
-      <w:r>
-        <w:rPr>
-          <w:lang w:val="en-IN"/>
-        </w:rPr>
-        <w:br/>
-        <w:t xml:space="preserve">    result = </w:t>
-      </w:r>
-      <w:proofErr w:type="spellStart"/>
-      <w:r>
-        <w:rPr>
-          <w:lang w:val="en-IN"/>
-        </w:rPr>
-        <w:t>cursor.fetchall</w:t>
-      </w:r>
-      <w:proofErr w:type="spellEnd"/>
-      <w:r>
-        <w:rPr>
-          <w:lang w:val="en-IN"/>
-        </w:rPr>
-        <w:t>()</w:t>
-      </w:r>
-      <w:r>
-        <w:rPr>
-          <w:lang w:val="en-IN"/>
-        </w:rPr>
-        <w:br/>
-      </w:r>
-      <w:r>
-        <w:rPr>
-          <w:lang w:val="en-IN"/>
-        </w:rPr>
-        <w:br/>
-        <w:t xml:space="preserve">    </w:t>
-      </w:r>
-      <w:proofErr w:type="spellStart"/>
-      <w:r>
-        <w:rPr>
-          <w:lang w:val="en-IN"/>
-        </w:rPr>
-        <w:t>cursor.close</w:t>
-      </w:r>
-      <w:proofErr w:type="spellEnd"/>
-      <w:r>
-        <w:rPr>
-          <w:lang w:val="en-IN"/>
-        </w:rPr>
-        <w:t>()</w:t>
-      </w:r>
-      <w:r>
-        <w:rPr>
-          <w:lang w:val="en-IN"/>
-        </w:rPr>
-        <w:br/>
-        <w:t xml:space="preserve">    </w:t>
-      </w:r>
-      <w:proofErr w:type="spellStart"/>
-      <w:r>
-        <w:rPr>
-          <w:lang w:val="en-IN"/>
-        </w:rPr>
-        <w:t>conn.close</w:t>
-      </w:r>
-      <w:proofErr w:type="spellEnd"/>
-      <w:r>
-        <w:rPr>
-          <w:lang w:val="en-IN"/>
-        </w:rPr>
-        <w:t>()</w:t>
+        <w:t xml:space="preserve">    cursor = conn.cursor()</w:t>
+      </w:r>
+      <w:r>
+        <w:rPr>
+          <w:lang w:val="en-IN"/>
+        </w:rPr>
+        <w:br/>
+        <w:t xml:space="preserve">    cursor.execute(query)</w:t>
+      </w:r>
+      <w:r>
+        <w:rPr>
+          <w:lang w:val="en-IN"/>
+        </w:rPr>
+        <w:br/>
+        <w:t xml:space="preserve">    result = cursor.fetchall()</w:t>
+      </w:r>
+      <w:r>
+        <w:rPr>
+          <w:lang w:val="en-IN"/>
+        </w:rPr>
+        <w:br/>
+      </w:r>
+      <w:r>
+        <w:rPr>
+          <w:lang w:val="en-IN"/>
+        </w:rPr>
+        <w:br/>
+        <w:t xml:space="preserve">    cursor.close()</w:t>
+      </w:r>
+      <w:r>
+        <w:rPr>
+          <w:lang w:val="en-IN"/>
+        </w:rPr>
+        <w:br/>
+        <w:t xml:space="preserve">    conn.close()</w:t>
       </w:r>
       <w:r>
         <w:rPr>
@@ -1149,77 +878,21 @@
           <w:lang w:val="en-IN"/>
         </w:rPr>
         <w:br/>
-        <w:t xml:space="preserve">def </w:t>
-      </w:r>
-      <w:proofErr w:type="spellStart"/>
-      <w:r>
-        <w:rPr>
-          <w:lang w:val="en-IN"/>
-        </w:rPr>
-        <w:t>run_sql</w:t>
-      </w:r>
-      <w:proofErr w:type="spellEnd"/>
-      <w:r>
-        <w:rPr>
-          <w:lang w:val="en-IN"/>
-        </w:rPr>
-        <w:t xml:space="preserve">(payload: </w:t>
-      </w:r>
-      <w:proofErr w:type="spellStart"/>
-      <w:r>
-        <w:rPr>
-          <w:lang w:val="en-IN"/>
-        </w:rPr>
-        <w:t>dict</w:t>
-      </w:r>
-      <w:proofErr w:type="spellEnd"/>
-      <w:r>
-        <w:rPr>
-          <w:lang w:val="en-IN"/>
-        </w:rPr>
-        <w:t>):</w:t>
-      </w:r>
-      <w:r>
-        <w:rPr>
-          <w:lang w:val="en-IN"/>
-        </w:rPr>
-        <w:br/>
-        <w:t xml:space="preserve">    query = </w:t>
-      </w:r>
-      <w:proofErr w:type="spellStart"/>
-      <w:r>
-        <w:rPr>
-          <w:lang w:val="en-IN"/>
-        </w:rPr>
-        <w:t>payload.get</w:t>
-      </w:r>
-      <w:proofErr w:type="spellEnd"/>
-      <w:r>
-        <w:rPr>
-          <w:lang w:val="en-IN"/>
-        </w:rPr>
-        <w:t>("query")</w:t>
-      </w:r>
-      <w:r>
-        <w:rPr>
-          <w:lang w:val="en-IN"/>
-        </w:rPr>
-        <w:br/>
-        <w:t xml:space="preserve">    result = </w:t>
-      </w:r>
-      <w:proofErr w:type="spellStart"/>
-      <w:r>
-        <w:rPr>
-          <w:lang w:val="en-IN"/>
-        </w:rPr>
-        <w:t>run_query</w:t>
-      </w:r>
-      <w:proofErr w:type="spellEnd"/>
-      <w:r>
-        <w:rPr>
-          <w:lang w:val="en-IN"/>
-        </w:rPr>
-        <w:t>(query)</w:t>
+        <w:t>def run_sql(payload: dict):</w:t>
+      </w:r>
+      <w:r>
+        <w:rPr>
+          <w:lang w:val="en-IN"/>
+        </w:rPr>
+        <w:br/>
+        <w:t xml:space="preserve">    query = payload.get("query")</w:t>
+      </w:r>
+      <w:r>
+        <w:rPr>
+          <w:lang w:val="en-IN"/>
+        </w:rPr>
+        <w:br/>
+        <w:t xml:space="preserve">    result = run_query(query)</w:t>
       </w:r>
       <w:r>
         <w:rPr>
@@ -1240,7 +913,7 @@
           <w:lang w:val="en-IN"/>
         </w:rPr>
         <w:pict w14:anchorId="0E689AD1">
-          <v:rect id="_x0000_i1233" style="width:0;height:1.5pt" o:hralign="center" o:hrstd="t" o:hr="t" fillcolor="#a0a0a0" stroked="f"/>
+          <v:rect id="_x0000_i1035" style="width:0;height:1.5pt" o:hralign="center" o:hrstd="t" o:hr="t" fillcolor="#a0a0a0" stroked="f"/>
         </w:pict>
       </w:r>
     </w:p>
@@ -1267,33 +940,11 @@
           <w:lang w:val="en-IN"/>
         </w:rPr>
       </w:pPr>
-      <w:proofErr w:type="spellStart"/>
-      <w:r>
-        <w:rPr>
-          <w:lang w:val="en-IN"/>
-        </w:rPr>
-        <w:t>uvicorn</w:t>
-      </w:r>
-      <w:proofErr w:type="spellEnd"/>
-      <w:r>
-        <w:rPr>
-          <w:lang w:val="en-IN"/>
-        </w:rPr>
-        <w:t xml:space="preserve"> </w:t>
-      </w:r>
-      <w:proofErr w:type="spellStart"/>
-      <w:r>
-        <w:rPr>
-          <w:lang w:val="en-IN"/>
-        </w:rPr>
-        <w:t>app:app</w:t>
-      </w:r>
-      <w:proofErr w:type="spellEnd"/>
-      <w:r>
-        <w:rPr>
-          <w:lang w:val="en-IN"/>
-        </w:rPr>
-        <w:t xml:space="preserve"> --reload</w:t>
+      <w:r>
+        <w:rPr>
+          <w:lang w:val="en-IN"/>
+        </w:rPr>
+        <w:t>uvicorn app:app --reload</w:t>
       </w:r>
     </w:p>
     <w:p>
@@ -1307,7 +958,7 @@
           <w:lang w:val="en-IN"/>
         </w:rPr>
         <w:pict w14:anchorId="5E07EC76">
-          <v:rect id="_x0000_i1234" style="width:0;height:1.5pt" o:hralign="center" o:hrstd="t" o:hr="t" fillcolor="#a0a0a0" stroked="f"/>
+          <v:rect id="_x0000_i1036" style="width:0;height:1.5pt" o:hralign="center" o:hrstd="t" o:hr="t" fillcolor="#a0a0a0" stroked="f"/>
         </w:pict>
       </w:r>
     </w:p>
@@ -1345,42 +996,14 @@
           <w:lang w:val="en-IN"/>
         </w:rPr>
         <w:br/>
-        <w:t>-H "Content-Type: application/</w:t>
-      </w:r>
-      <w:proofErr w:type="spellStart"/>
-      <w:r>
-        <w:rPr>
-          <w:lang w:val="en-IN"/>
-        </w:rPr>
-        <w:t>json</w:t>
-      </w:r>
-      <w:proofErr w:type="spellEnd"/>
-      <w:r>
-        <w:rPr>
-          <w:lang w:val="en-IN"/>
-        </w:rPr>
-        <w:t>" \</w:t>
-      </w:r>
-      <w:r>
-        <w:rPr>
-          <w:lang w:val="en-IN"/>
-        </w:rPr>
-        <w:br/>
-        <w:t xml:space="preserve">-d '{"query": "SELECT * FROM </w:t>
-      </w:r>
-      <w:proofErr w:type="spellStart"/>
-      <w:r>
-        <w:rPr>
-          <w:lang w:val="en-IN"/>
-        </w:rPr>
-        <w:t>sales_data</w:t>
-      </w:r>
-      <w:proofErr w:type="spellEnd"/>
-      <w:r>
-        <w:rPr>
-          <w:lang w:val="en-IN"/>
-        </w:rPr>
-        <w:t>"}'</w:t>
+        <w:t>-H "Content-Type: application/json" \</w:t>
+      </w:r>
+      <w:r>
+        <w:rPr>
+          <w:lang w:val="en-IN"/>
+        </w:rPr>
+        <w:br/>
+        <w:t>-d '{"query": "SELECT * FROM sales_data"}'</w:t>
       </w:r>
     </w:p>
     <w:p>
@@ -1394,7 +1017,7 @@
           <w:lang w:val="en-IN"/>
         </w:rPr>
         <w:pict w14:anchorId="71074EF8">
-          <v:rect id="_x0000_i1235" style="width:0;height:1.5pt" o:hralign="center" o:hrstd="t" o:hr="t" fillcolor="#a0a0a0" stroked="f"/>
+          <v:rect id="_x0000_i1037" style="width:0;height:1.5pt" o:hralign="center" o:hrstd="t" o:hr="t" fillcolor="#a0a0a0" stroked="f"/>
         </w:pict>
       </w:r>
     </w:p>
@@ -1412,25 +1035,7 @@
           <w:bCs/>
           <w:lang w:val="en-IN"/>
         </w:rPr>
-        <w:t>LAB 3: Replace Claude with Local LLM (</w:t>
-      </w:r>
-      <w:proofErr w:type="spellStart"/>
-      <w:r>
-        <w:rPr>
-          <w:b/>
-          <w:bCs/>
-          <w:lang w:val="en-IN"/>
-        </w:rPr>
-        <w:t>Ollama</w:t>
-      </w:r>
-      <w:proofErr w:type="spellEnd"/>
-      <w:r>
-        <w:rPr>
-          <w:b/>
-          <w:bCs/>
-          <w:lang w:val="en-IN"/>
-        </w:rPr>
-        <w:t>)</w:t>
+        <w:t>LAB 3: Replace Claude with Local LLM (Ollama)</w:t>
       </w:r>
     </w:p>
     <w:p>
@@ -1444,7 +1049,7 @@
           <w:lang w:val="en-IN"/>
         </w:rPr>
         <w:pict w14:anchorId="406D73B5">
-          <v:rect id="_x0000_i1236" style="width:0;height:1.5pt" o:hralign="center" o:hrstd="t" o:hr="t" fillcolor="#a0a0a0" stroked="f"/>
+          <v:rect id="_x0000_i1038" style="width:0;height:1.5pt" o:hralign="center" o:hrstd="t" o:hr="t" fillcolor="#a0a0a0" stroked="f"/>
         </w:pict>
       </w:r>
     </w:p>
@@ -1488,45 +1093,15 @@
           <w:lang w:val="en-IN"/>
         </w:rPr>
         <w:br/>
-        <w:t xml:space="preserve">def </w:t>
-      </w:r>
-      <w:proofErr w:type="spellStart"/>
-      <w:r>
-        <w:rPr>
-          <w:lang w:val="en-IN"/>
-        </w:rPr>
-        <w:t>ask_llm</w:t>
-      </w:r>
-      <w:proofErr w:type="spellEnd"/>
-      <w:r>
-        <w:rPr>
-          <w:lang w:val="en-IN"/>
-        </w:rPr>
-        <w:t>(prompt):</w:t>
-      </w:r>
-      <w:r>
-        <w:rPr>
-          <w:lang w:val="en-IN"/>
-        </w:rPr>
-        <w:br/>
-        <w:t xml:space="preserve">    response = </w:t>
-      </w:r>
-      <w:proofErr w:type="spellStart"/>
-      <w:proofErr w:type="gramStart"/>
-      <w:r>
-        <w:rPr>
-          <w:lang w:val="en-IN"/>
-        </w:rPr>
-        <w:t>requests.post</w:t>
-      </w:r>
-      <w:proofErr w:type="spellEnd"/>
-      <w:r>
-        <w:rPr>
-          <w:lang w:val="en-IN"/>
-        </w:rPr>
-        <w:t>(</w:t>
-      </w:r>
-      <w:proofErr w:type="gramEnd"/>
+        <w:t>def ask_llm(prompt):</w:t>
+      </w:r>
+      <w:r>
+        <w:rPr>
+          <w:lang w:val="en-IN"/>
+        </w:rPr>
+        <w:br/>
+        <w:t xml:space="preserve">    response = requests.post(</w:t>
+      </w:r>
       <w:r>
         <w:rPr>
           <w:lang w:val="en-IN"/>
@@ -1539,24 +1114,8 @@
           <w:lang w:val="en-IN"/>
         </w:rPr>
         <w:br/>
-        <w:t xml:space="preserve">        </w:t>
-      </w:r>
-      <w:proofErr w:type="spellStart"/>
-      <w:r>
-        <w:rPr>
-          <w:lang w:val="en-IN"/>
-        </w:rPr>
-        <w:t>json</w:t>
-      </w:r>
-      <w:proofErr w:type="spellEnd"/>
-      <w:proofErr w:type="gramStart"/>
-      <w:r>
-        <w:rPr>
-          <w:lang w:val="en-IN"/>
-        </w:rPr>
-        <w:t>={</w:t>
-      </w:r>
-      <w:proofErr w:type="gramEnd"/>
+        <w:t xml:space="preserve">        json={</w:t>
+      </w:r>
       <w:r>
         <w:rPr>
           <w:lang w:val="en-IN"/>
@@ -1583,65 +1142,27 @@
           <w:lang w:val="en-IN"/>
         </w:rPr>
         <w:br/>
-        <w:t xml:space="preserve">      </w:t>
-      </w:r>
-      <w:proofErr w:type="gramStart"/>
-      <w:r>
-        <w:rPr>
-          <w:lang w:val="en-IN"/>
-        </w:rPr>
-        <w:t xml:space="preserve">  }</w:t>
-      </w:r>
-      <w:proofErr w:type="gramEnd"/>
-      <w:r>
-        <w:rPr>
-          <w:lang w:val="en-IN"/>
-        </w:rPr>
-        <w:br/>
-        <w:t xml:space="preserve">  </w:t>
-      </w:r>
-      <w:proofErr w:type="gramStart"/>
-      <w:r>
-        <w:rPr>
-          <w:lang w:val="en-IN"/>
-        </w:rPr>
-        <w:t xml:space="preserve">  )</w:t>
-      </w:r>
-      <w:proofErr w:type="gramEnd"/>
-      <w:r>
-        <w:rPr>
-          <w:lang w:val="en-IN"/>
-        </w:rPr>
-        <w:br/>
-      </w:r>
-      <w:r>
-        <w:rPr>
-          <w:lang w:val="en-IN"/>
-        </w:rPr>
-        <w:br/>
-        <w:t xml:space="preserve">    return </w:t>
-      </w:r>
-      <w:proofErr w:type="spellStart"/>
-      <w:proofErr w:type="gramStart"/>
-      <w:r>
-        <w:rPr>
-          <w:lang w:val="en-IN"/>
-        </w:rPr>
-        <w:t>response.json</w:t>
-      </w:r>
-      <w:proofErr w:type="spellEnd"/>
-      <w:r>
-        <w:rPr>
-          <w:lang w:val="en-IN"/>
-        </w:rPr>
-        <w:t>()[</w:t>
-      </w:r>
-      <w:proofErr w:type="gramEnd"/>
-      <w:r>
-        <w:rPr>
-          <w:lang w:val="en-IN"/>
-        </w:rPr>
-        <w:t>"response"]</w:t>
+        <w:t xml:space="preserve">        }</w:t>
+      </w:r>
+      <w:r>
+        <w:rPr>
+          <w:lang w:val="en-IN"/>
+        </w:rPr>
+        <w:br/>
+        <w:t xml:space="preserve">    )</w:t>
+      </w:r>
+      <w:r>
+        <w:rPr>
+          <w:lang w:val="en-IN"/>
+        </w:rPr>
+        <w:br/>
+      </w:r>
+      <w:r>
+        <w:rPr>
+          <w:lang w:val="en-IN"/>
+        </w:rPr>
+        <w:br/>
+        <w:t xml:space="preserve">    return response.json()["response"]</w:t>
       </w:r>
     </w:p>
     <w:p>
@@ -1655,7 +1176,7 @@
           <w:lang w:val="en-IN"/>
         </w:rPr>
         <w:pict w14:anchorId="41FCCB15">
-          <v:rect id="_x0000_i1237" style="width:0;height:1.5pt" o:hralign="center" o:hrstd="t" o:hr="t" fillcolor="#a0a0a0" stroked="f"/>
+          <v:rect id="_x0000_i1039" style="width:0;height:1.5pt" o:hralign="center" o:hrstd="t" o:hr="t" fillcolor="#a0a0a0" stroked="f"/>
         </w:pict>
       </w:r>
     </w:p>
@@ -1687,7 +1208,7 @@
           <w:lang w:val="en-IN"/>
         </w:rPr>
         <w:pict w14:anchorId="1A07C6CA">
-          <v:rect id="_x0000_i1238" style="width:0;height:1.5pt" o:hralign="center" o:hrstd="t" o:hr="t" fillcolor="#a0a0a0" stroked="f"/>
+          <v:rect id="_x0000_i1040" style="width:0;height:1.5pt" o:hralign="center" o:hrstd="t" o:hr="t" fillcolor="#a0a0a0" stroked="f"/>
         </w:pict>
       </w:r>
     </w:p>
@@ -1725,30 +1246,8 @@
           <w:lang w:val="en-IN"/>
         </w:rPr>
         <w:br/>
-        <w:t xml:space="preserve">from </w:t>
-      </w:r>
-      <w:proofErr w:type="spellStart"/>
-      <w:r>
-        <w:rPr>
-          <w:lang w:val="en-IN"/>
-        </w:rPr>
-        <w:t>llm</w:t>
-      </w:r>
-      <w:proofErr w:type="spellEnd"/>
-      <w:r>
-        <w:rPr>
-          <w:lang w:val="en-IN"/>
-        </w:rPr>
-        <w:t xml:space="preserve"> import </w:t>
-      </w:r>
-      <w:proofErr w:type="spellStart"/>
-      <w:r>
-        <w:rPr>
-          <w:lang w:val="en-IN"/>
-        </w:rPr>
-        <w:t>ask_llm</w:t>
-      </w:r>
-      <w:proofErr w:type="spellEnd"/>
+        <w:t>from llm import ask_llm</w:t>
+      </w:r>
       <w:r>
         <w:rPr>
           <w:lang w:val="en-IN"/>
@@ -1787,34 +1286,7 @@
           <w:lang w:val="en-IN"/>
         </w:rPr>
         <w:br/>
-      </w:r>
-      <w:proofErr w:type="spellStart"/>
-      <w:r>
-        <w:rPr>
-          <w:lang w:val="en-IN"/>
-        </w:rPr>
-        <w:t>sales_data</w:t>
-      </w:r>
-      <w:proofErr w:type="spellEnd"/>
-      <w:r>
-        <w:rPr>
-          <w:lang w:val="en-IN"/>
-        </w:rPr>
-        <w:t xml:space="preserve">(id, region, revenue, </w:t>
-      </w:r>
-      <w:proofErr w:type="spellStart"/>
-      <w:r>
-        <w:rPr>
-          <w:lang w:val="en-IN"/>
-        </w:rPr>
-        <w:t>sale_date</w:t>
-      </w:r>
-      <w:proofErr w:type="spellEnd"/>
-      <w:r>
-        <w:rPr>
-          <w:lang w:val="en-IN"/>
-        </w:rPr>
-        <w:t>)</w:t>
+        <w:t>sales_data(id, region, revenue, sale_date)</w:t>
       </w:r>
       <w:r>
         <w:rPr>
@@ -1861,160 +1333,40 @@
           <w:lang w:val="en-IN"/>
         </w:rPr>
         <w:br/>
-        <w:t xml:space="preserve">def </w:t>
-      </w:r>
-      <w:proofErr w:type="spellStart"/>
-      <w:r>
-        <w:rPr>
-          <w:lang w:val="en-IN"/>
-        </w:rPr>
-        <w:t>process_prompt</w:t>
-      </w:r>
-      <w:proofErr w:type="spellEnd"/>
-      <w:r>
-        <w:rPr>
-          <w:lang w:val="en-IN"/>
-        </w:rPr>
-        <w:t>(</w:t>
-      </w:r>
-      <w:proofErr w:type="spellStart"/>
-      <w:r>
-        <w:rPr>
-          <w:lang w:val="en-IN"/>
-        </w:rPr>
-        <w:t>user_input</w:t>
-      </w:r>
-      <w:proofErr w:type="spellEnd"/>
-      <w:r>
-        <w:rPr>
-          <w:lang w:val="en-IN"/>
-        </w:rPr>
-        <w:t>):</w:t>
-      </w:r>
-      <w:r>
-        <w:rPr>
-          <w:lang w:val="en-IN"/>
-        </w:rPr>
-        <w:br/>
-        <w:t xml:space="preserve">    </w:t>
-      </w:r>
-      <w:proofErr w:type="spellStart"/>
-      <w:r>
-        <w:rPr>
-          <w:lang w:val="en-IN"/>
-        </w:rPr>
-        <w:t>full_prompt</w:t>
-      </w:r>
-      <w:proofErr w:type="spellEnd"/>
-      <w:r>
-        <w:rPr>
-          <w:lang w:val="en-IN"/>
-        </w:rPr>
-        <w:t xml:space="preserve"> = SYSTEM_PROMPT + "\</w:t>
-      </w:r>
-      <w:proofErr w:type="spellStart"/>
-      <w:r>
-        <w:rPr>
-          <w:lang w:val="en-IN"/>
-        </w:rPr>
-        <w:t>nUser</w:t>
-      </w:r>
-      <w:proofErr w:type="spellEnd"/>
-      <w:r>
-        <w:rPr>
-          <w:lang w:val="en-IN"/>
-        </w:rPr>
-        <w:t xml:space="preserve">: " + </w:t>
-      </w:r>
-      <w:proofErr w:type="spellStart"/>
-      <w:r>
-        <w:rPr>
-          <w:lang w:val="en-IN"/>
-        </w:rPr>
-        <w:t>user_input</w:t>
-      </w:r>
-      <w:proofErr w:type="spellEnd"/>
-      <w:r>
-        <w:rPr>
-          <w:lang w:val="en-IN"/>
-        </w:rPr>
-        <w:br/>
-      </w:r>
-      <w:r>
-        <w:rPr>
-          <w:lang w:val="en-IN"/>
-        </w:rPr>
-        <w:br/>
-        <w:t xml:space="preserve">    </w:t>
-      </w:r>
-      <w:proofErr w:type="spellStart"/>
-      <w:r>
-        <w:rPr>
-          <w:lang w:val="en-IN"/>
-        </w:rPr>
-        <w:t>sql_query</w:t>
-      </w:r>
-      <w:proofErr w:type="spellEnd"/>
-      <w:r>
-        <w:rPr>
-          <w:lang w:val="en-IN"/>
-        </w:rPr>
-        <w:t xml:space="preserve"> = </w:t>
-      </w:r>
-      <w:proofErr w:type="spellStart"/>
-      <w:r>
-        <w:rPr>
-          <w:lang w:val="en-IN"/>
-        </w:rPr>
-        <w:t>ask_llm</w:t>
-      </w:r>
-      <w:proofErr w:type="spellEnd"/>
-      <w:r>
-        <w:rPr>
-          <w:lang w:val="en-IN"/>
-        </w:rPr>
-        <w:t>(</w:t>
-      </w:r>
-      <w:proofErr w:type="spellStart"/>
-      <w:r>
-        <w:rPr>
-          <w:lang w:val="en-IN"/>
-        </w:rPr>
-        <w:t>full_prompt</w:t>
-      </w:r>
-      <w:proofErr w:type="spellEnd"/>
-      <w:r>
-        <w:rPr>
-          <w:lang w:val="en-IN"/>
-        </w:rPr>
-        <w:t>)</w:t>
-      </w:r>
-      <w:r>
-        <w:rPr>
-          <w:lang w:val="en-IN"/>
-        </w:rPr>
-        <w:br/>
-      </w:r>
-      <w:r>
-        <w:rPr>
-          <w:lang w:val="en-IN"/>
-        </w:rPr>
-        <w:br/>
-        <w:t xml:space="preserve">    print("Generated SQL:", </w:t>
-      </w:r>
-      <w:proofErr w:type="spellStart"/>
-      <w:r>
-        <w:rPr>
-          <w:lang w:val="en-IN"/>
-        </w:rPr>
-        <w:t>sql_query</w:t>
-      </w:r>
-      <w:proofErr w:type="spellEnd"/>
-      <w:r>
-        <w:rPr>
-          <w:lang w:val="en-IN"/>
-        </w:rPr>
-        <w:t>)</w:t>
+        <w:t>def process_prompt(user_input):</w:t>
+      </w:r>
+      <w:r>
+        <w:rPr>
+          <w:lang w:val="en-IN"/>
+        </w:rPr>
+        <w:br/>
+        <w:t xml:space="preserve">    full_prompt = SYSTEM_PROMPT + "\nUser: " + user_input</w:t>
+      </w:r>
+      <w:r>
+        <w:rPr>
+          <w:lang w:val="en-IN"/>
+        </w:rPr>
+        <w:br/>
+      </w:r>
+      <w:r>
+        <w:rPr>
+          <w:lang w:val="en-IN"/>
+        </w:rPr>
+        <w:br/>
+        <w:t xml:space="preserve">    sql_query = ask_llm(full_prompt)</w:t>
+      </w:r>
+      <w:r>
+        <w:rPr>
+          <w:lang w:val="en-IN"/>
+        </w:rPr>
+        <w:br/>
+      </w:r>
+      <w:r>
+        <w:rPr>
+          <w:lang w:val="en-IN"/>
+        </w:rPr>
+        <w:br/>
+        <w:t xml:space="preserve">    print("Generated SQL:", sql_query)</w:t>
       </w:r>
       <w:r>
         <w:rPr>
@@ -2034,77 +1386,21 @@
           <w:lang w:val="en-IN"/>
         </w:rPr>
         <w:br/>
-        <w:t xml:space="preserve">    response = </w:t>
-      </w:r>
-      <w:proofErr w:type="spellStart"/>
-      <w:r>
-        <w:rPr>
-          <w:lang w:val="en-IN"/>
-        </w:rPr>
-        <w:t>requests.post</w:t>
-      </w:r>
-      <w:proofErr w:type="spellEnd"/>
-      <w:r>
-        <w:rPr>
-          <w:lang w:val="en-IN"/>
-        </w:rPr>
-        <w:t>(</w:t>
-      </w:r>
-      <w:r>
-        <w:rPr>
-          <w:lang w:val="en-IN"/>
-        </w:rPr>
-        <w:br/>
-        <w:t xml:space="preserve">        "http://127.0.0.1:8000/</w:t>
-      </w:r>
-      <w:proofErr w:type="spellStart"/>
-      <w:r>
-        <w:rPr>
-          <w:lang w:val="en-IN"/>
-        </w:rPr>
-        <w:t>run_sql</w:t>
-      </w:r>
-      <w:proofErr w:type="spellEnd"/>
-      <w:r>
-        <w:rPr>
-          <w:lang w:val="en-IN"/>
-        </w:rPr>
-        <w:t>",</w:t>
-      </w:r>
-      <w:r>
-        <w:rPr>
-          <w:lang w:val="en-IN"/>
-        </w:rPr>
-        <w:br/>
-        <w:t xml:space="preserve">        </w:t>
-      </w:r>
-      <w:proofErr w:type="spellStart"/>
-      <w:r>
-        <w:rPr>
-          <w:lang w:val="en-IN"/>
-        </w:rPr>
-        <w:t>json</w:t>
-      </w:r>
-      <w:proofErr w:type="spellEnd"/>
-      <w:r>
-        <w:rPr>
-          <w:lang w:val="en-IN"/>
-        </w:rPr>
-        <w:t xml:space="preserve">={"query": </w:t>
-      </w:r>
-      <w:proofErr w:type="spellStart"/>
-      <w:r>
-        <w:rPr>
-          <w:lang w:val="en-IN"/>
-        </w:rPr>
-        <w:t>sql_query</w:t>
-      </w:r>
-      <w:proofErr w:type="spellEnd"/>
-      <w:r>
-        <w:rPr>
-          <w:lang w:val="en-IN"/>
-        </w:rPr>
-        <w:t>}</w:t>
+        <w:t xml:space="preserve">    response = requests.post(</w:t>
+      </w:r>
+      <w:r>
+        <w:rPr>
+          <w:lang w:val="en-IN"/>
+        </w:rPr>
+        <w:br/>
+        <w:t xml:space="preserve">        "http://127.0.0.1:8000/run_sql",</w:t>
+      </w:r>
+      <w:r>
+        <w:rPr>
+          <w:lang w:val="en-IN"/>
+        </w:rPr>
+        <w:br/>
+        <w:t xml:space="preserve">        json={"query": sql_query}</w:t>
       </w:r>
       <w:r>
         <w:rPr>
@@ -2124,21 +1420,7 @@
           <w:lang w:val="en-IN"/>
         </w:rPr>
         <w:br/>
-        <w:t xml:space="preserve">    return </w:t>
-      </w:r>
-      <w:proofErr w:type="spellStart"/>
-      <w:r>
-        <w:rPr>
-          <w:lang w:val="en-IN"/>
-        </w:rPr>
-        <w:t>response.json</w:t>
-      </w:r>
-      <w:proofErr w:type="spellEnd"/>
-      <w:r>
-        <w:rPr>
-          <w:lang w:val="en-IN"/>
-        </w:rPr>
-        <w:t>()</w:t>
+        <w:t xml:space="preserve">    return response.json()</w:t>
       </w:r>
     </w:p>
     <w:p>
@@ -2152,7 +1434,7 @@
           <w:lang w:val="en-IN"/>
         </w:rPr>
         <w:pict w14:anchorId="3761E4E9">
-          <v:rect id="_x0000_i1239" style="width:0;height:1.5pt" o:hralign="center" o:hrstd="t" o:hr="t" fillcolor="#a0a0a0" stroked="f"/>
+          <v:rect id="_x0000_i1041" style="width:0;height:1.5pt" o:hralign="center" o:hrstd="t" o:hr="t" fillcolor="#a0a0a0" stroked="f"/>
         </w:pict>
       </w:r>
     </w:p>
@@ -2184,7 +1466,7 @@
           <w:lang w:val="en-IN"/>
         </w:rPr>
         <w:pict w14:anchorId="41979AF5">
-          <v:rect id="_x0000_i1240" style="width:0;height:1.5pt" o:hralign="center" o:hrstd="t" o:hr="t" fillcolor="#a0a0a0" stroked="f"/>
+          <v:rect id="_x0000_i1042" style="width:0;height:1.5pt" o:hralign="center" o:hrstd="t" o:hr="t" fillcolor="#a0a0a0" stroked="f"/>
         </w:pict>
       </w:r>
     </w:p>
@@ -2215,16 +1497,8 @@
         <w:rPr>
           <w:lang w:val="en-IN"/>
         </w:rPr>
-        <w:t xml:space="preserve">from agent import </w:t>
-      </w:r>
-      <w:proofErr w:type="spellStart"/>
-      <w:r>
-        <w:rPr>
-          <w:lang w:val="en-IN"/>
-        </w:rPr>
-        <w:t>process_prompt</w:t>
-      </w:r>
-      <w:proofErr w:type="spellEnd"/>
+        <w:t>from agent import process_prompt</w:t>
+      </w:r>
       <w:r>
         <w:rPr>
           <w:lang w:val="en-IN"/>
@@ -2243,103 +1517,33 @@
           <w:lang w:val="en-IN"/>
         </w:rPr>
         <w:br/>
-        <w:t xml:space="preserve">    </w:t>
-      </w:r>
-      <w:proofErr w:type="spellStart"/>
-      <w:r>
-        <w:rPr>
-          <w:lang w:val="en-IN"/>
-        </w:rPr>
-        <w:t>user_input</w:t>
-      </w:r>
-      <w:proofErr w:type="spellEnd"/>
-      <w:r>
-        <w:rPr>
-          <w:lang w:val="en-IN"/>
-        </w:rPr>
-        <w:t xml:space="preserve"> = </w:t>
-      </w:r>
-      <w:proofErr w:type="gramStart"/>
-      <w:r>
-        <w:rPr>
-          <w:lang w:val="en-IN"/>
-        </w:rPr>
-        <w:t>input(</w:t>
-      </w:r>
-      <w:proofErr w:type="gramEnd"/>
-      <w:r>
-        <w:rPr>
-          <w:lang w:val="en-IN"/>
-        </w:rPr>
-        <w:t>"Ask: ")</w:t>
-      </w:r>
-      <w:r>
-        <w:rPr>
-          <w:lang w:val="en-IN"/>
-        </w:rPr>
-        <w:br/>
-      </w:r>
-      <w:r>
-        <w:rPr>
-          <w:lang w:val="en-IN"/>
-        </w:rPr>
-        <w:br/>
-        <w:t xml:space="preserve">    result = </w:t>
-      </w:r>
-      <w:proofErr w:type="spellStart"/>
-      <w:r>
-        <w:rPr>
-          <w:lang w:val="en-IN"/>
-        </w:rPr>
-        <w:t>process_prompt</w:t>
-      </w:r>
-      <w:proofErr w:type="spellEnd"/>
-      <w:r>
-        <w:rPr>
-          <w:lang w:val="en-IN"/>
-        </w:rPr>
-        <w:t>(</w:t>
-      </w:r>
-      <w:proofErr w:type="spellStart"/>
-      <w:r>
-        <w:rPr>
-          <w:lang w:val="en-IN"/>
-        </w:rPr>
-        <w:t>user_input</w:t>
-      </w:r>
-      <w:proofErr w:type="spellEnd"/>
-      <w:r>
-        <w:rPr>
-          <w:lang w:val="en-IN"/>
-        </w:rPr>
-        <w:t>)</w:t>
-      </w:r>
-      <w:r>
-        <w:rPr>
-          <w:lang w:val="en-IN"/>
-        </w:rPr>
-        <w:br/>
-      </w:r>
-      <w:r>
-        <w:rPr>
-          <w:lang w:val="en-IN"/>
-        </w:rPr>
-        <w:br/>
-        <w:t xml:space="preserve">    </w:t>
-      </w:r>
-      <w:proofErr w:type="gramStart"/>
-      <w:r>
-        <w:rPr>
-          <w:lang w:val="en-IN"/>
-        </w:rPr>
-        <w:t>print(</w:t>
-      </w:r>
-      <w:proofErr w:type="gramEnd"/>
-      <w:r>
-        <w:rPr>
-          <w:lang w:val="en-IN"/>
-        </w:rPr>
-        <w:t>"Result:", result)</w:t>
+        <w:t xml:space="preserve">    user_input = input("Ask: ")</w:t>
+      </w:r>
+      <w:r>
+        <w:rPr>
+          <w:lang w:val="en-IN"/>
+        </w:rPr>
+        <w:br/>
+      </w:r>
+      <w:r>
+        <w:rPr>
+          <w:lang w:val="en-IN"/>
+        </w:rPr>
+        <w:br/>
+        <w:t xml:space="preserve">    result = process_prompt(user_input)</w:t>
+      </w:r>
+      <w:r>
+        <w:rPr>
+          <w:lang w:val="en-IN"/>
+        </w:rPr>
+        <w:br/>
+      </w:r>
+      <w:r>
+        <w:rPr>
+          <w:lang w:val="en-IN"/>
+        </w:rPr>
+        <w:br/>
+        <w:t xml:space="preserve">    print("Result:", result)</w:t>
       </w:r>
     </w:p>
     <w:p>
@@ -2353,7 +1557,7 @@
           <w:lang w:val="en-IN"/>
         </w:rPr>
         <w:pict w14:anchorId="70207A73">
-          <v:rect id="_x0000_i1241" style="width:0;height:1.5pt" o:hralign="center" o:hrstd="t" o:hr="t" fillcolor="#a0a0a0" stroked="f"/>
+          <v:rect id="_x0000_i1043" style="width:0;height:1.5pt" o:hralign="center" o:hrstd="t" o:hr="t" fillcolor="#a0a0a0" stroked="f"/>
         </w:pict>
       </w:r>
     </w:p>
@@ -2398,7 +1602,7 @@
           <w:lang w:val="en-IN"/>
         </w:rPr>
         <w:pict w14:anchorId="290678A0">
-          <v:rect id="_x0000_i1242" style="width:0;height:1.5pt" o:hralign="center" o:hrstd="t" o:hr="t" fillcolor="#a0a0a0" stroked="f"/>
+          <v:rect id="_x0000_i1044" style="width:0;height:1.5pt" o:hralign="center" o:hrstd="t" o:hr="t" fillcolor="#a0a0a0" stroked="f"/>
         </w:pict>
       </w:r>
     </w:p>
@@ -2430,7 +1634,7 @@
           <w:lang w:val="en-IN"/>
         </w:rPr>
         <w:pict w14:anchorId="784E6CDC">
-          <v:rect id="_x0000_i1243" style="width:0;height:1.5pt" o:hralign="center" o:hrstd="t" o:hr="t" fillcolor="#a0a0a0" stroked="f"/>
+          <v:rect id="_x0000_i1045" style="width:0;height:1.5pt" o:hralign="center" o:hrstd="t" o:hr="t" fillcolor="#a0a0a0" stroked="f"/>
         </w:pict>
       </w:r>
     </w:p>
@@ -2461,21 +1665,7 @@
         <w:rPr>
           <w:lang w:val="en-IN"/>
         </w:rPr>
-        <w:t xml:space="preserve">Ask: Describe </w:t>
-      </w:r>
-      <w:proofErr w:type="spellStart"/>
-      <w:r>
-        <w:rPr>
-          <w:lang w:val="en-IN"/>
-        </w:rPr>
-        <w:t>sales_data</w:t>
-      </w:r>
-      <w:proofErr w:type="spellEnd"/>
-      <w:r>
-        <w:rPr>
-          <w:lang w:val="en-IN"/>
-        </w:rPr>
-        <w:t xml:space="preserve"> table</w:t>
+        <w:t>Ask: Describe sales_data table</w:t>
       </w:r>
     </w:p>
     <w:p>
@@ -2501,21 +1691,7 @@
         <w:rPr>
           <w:lang w:val="en-IN"/>
         </w:rPr>
-        <w:t xml:space="preserve">DESC TABLE </w:t>
-      </w:r>
-      <w:proofErr w:type="spellStart"/>
-      <w:r>
-        <w:rPr>
-          <w:lang w:val="en-IN"/>
-        </w:rPr>
-        <w:t>sales_data</w:t>
-      </w:r>
-      <w:proofErr w:type="spellEnd"/>
-      <w:r>
-        <w:rPr>
-          <w:lang w:val="en-IN"/>
-        </w:rPr>
-        <w:t>;</w:t>
+        <w:t>DESC TABLE sales_data;</w:t>
       </w:r>
     </w:p>
     <w:p>
@@ -2529,7 +1705,7 @@
           <w:lang w:val="en-IN"/>
         </w:rPr>
         <w:pict w14:anchorId="73B332D9">
-          <v:rect id="_x0000_i1244" style="width:0;height:1.5pt" o:hralign="center" o:hrstd="t" o:hr="t" fillcolor="#a0a0a0" stroked="f"/>
+          <v:rect id="_x0000_i1046" style="width:0;height:1.5pt" o:hralign="center" o:hrstd="t" o:hr="t" fillcolor="#a0a0a0" stroked="f"/>
         </w:pict>
       </w:r>
     </w:p>
@@ -2586,37 +1762,15 @@
         <w:rPr>
           <w:lang w:val="en-IN"/>
         </w:rPr>
-        <w:t xml:space="preserve">SELECT region, </w:t>
-      </w:r>
-      <w:proofErr w:type="gramStart"/>
-      <w:r>
-        <w:rPr>
-          <w:lang w:val="en-IN"/>
-        </w:rPr>
-        <w:t>SUM(</w:t>
-      </w:r>
-      <w:proofErr w:type="gramEnd"/>
-      <w:r>
-        <w:rPr>
-          <w:lang w:val="en-IN"/>
-        </w:rPr>
-        <w:t>revenue)</w:t>
-      </w:r>
-      <w:r>
-        <w:rPr>
-          <w:lang w:val="en-IN"/>
-        </w:rPr>
-        <w:br/>
-        <w:t xml:space="preserve">FROM </w:t>
-      </w:r>
-      <w:proofErr w:type="spellStart"/>
-      <w:r>
-        <w:rPr>
-          <w:lang w:val="en-IN"/>
-        </w:rPr>
-        <w:t>sales_data</w:t>
-      </w:r>
-      <w:proofErr w:type="spellEnd"/>
+        <w:t>SELECT region, SUM(revenue)</w:t>
+      </w:r>
+      <w:r>
+        <w:rPr>
+          <w:lang w:val="en-IN"/>
+        </w:rPr>
+        <w:br/>
+        <w:t>FROM sales_data</w:t>
+      </w:r>
       <w:r>
         <w:rPr>
           <w:lang w:val="en-IN"/>
@@ -2636,7 +1790,7 @@
           <w:lang w:val="en-IN"/>
         </w:rPr>
         <w:pict w14:anchorId="3CB2A3A5">
-          <v:rect id="_x0000_i1245" style="width:0;height:1.5pt" o:hralign="center" o:hrstd="t" o:hr="t" fillcolor="#a0a0a0" stroked="f"/>
+          <v:rect id="_x0000_i1047" style="width:0;height:1.5pt" o:hralign="center" o:hrstd="t" o:hr="t" fillcolor="#a0a0a0" stroked="f"/>
         </w:pict>
       </w:r>
     </w:p>
@@ -2667,16 +1821,8 @@
         <w:rPr>
           <w:lang w:val="en-IN"/>
         </w:rPr>
-        <w:t xml:space="preserve">Ask: Count rows in </w:t>
-      </w:r>
-      <w:proofErr w:type="spellStart"/>
-      <w:r>
-        <w:rPr>
-          <w:lang w:val="en-IN"/>
-        </w:rPr>
-        <w:t>sales_data</w:t>
-      </w:r>
-      <w:proofErr w:type="spellEnd"/>
+        <w:t>Ask: Count rows in sales_data</w:t>
+      </w:r>
     </w:p>
     <w:p>
       <w:pPr>
@@ -2701,35 +1847,7 @@
         <w:rPr>
           <w:lang w:val="en-IN"/>
         </w:rPr>
-        <w:t xml:space="preserve">SELECT </w:t>
-      </w:r>
-      <w:proofErr w:type="gramStart"/>
-      <w:r>
-        <w:rPr>
-          <w:lang w:val="en-IN"/>
-        </w:rPr>
-        <w:t>COUNT(</w:t>
-      </w:r>
-      <w:proofErr w:type="gramEnd"/>
-      <w:r>
-        <w:rPr>
-          <w:lang w:val="en-IN"/>
-        </w:rPr>
-        <w:t xml:space="preserve">*) FROM </w:t>
-      </w:r>
-      <w:proofErr w:type="spellStart"/>
-      <w:r>
-        <w:rPr>
-          <w:lang w:val="en-IN"/>
-        </w:rPr>
-        <w:t>sales_data</w:t>
-      </w:r>
-      <w:proofErr w:type="spellEnd"/>
-      <w:r>
-        <w:rPr>
-          <w:lang w:val="en-IN"/>
-        </w:rPr>
-        <w:t>;</w:t>
+        <w:t>SELECT COUNT(*) FROM sales_data;</w:t>
       </w:r>
     </w:p>
     <w:p>
@@ -2743,7 +1861,7 @@
           <w:lang w:val="en-IN"/>
         </w:rPr>
         <w:pict w14:anchorId="2C3CD1AD">
-          <v:rect id="_x0000_i1246" style="width:0;height:1.5pt" o:hralign="center" o:hrstd="t" o:hr="t" fillcolor="#a0a0a0" stroked="f"/>
+          <v:rect id="_x0000_i1048" style="width:0;height:1.5pt" o:hralign="center" o:hrstd="t" o:hr="t" fillcolor="#a0a0a0" stroked="f"/>
         </w:pict>
       </w:r>
     </w:p>
@@ -2775,7 +1893,7 @@
           <w:lang w:val="en-IN"/>
         </w:rPr>
         <w:pict w14:anchorId="3444A06E">
-          <v:rect id="_x0000_i1247" style="width:0;height:1.5pt" o:hralign="center" o:hrstd="t" o:hr="t" fillcolor="#a0a0a0" stroked="f"/>
+          <v:rect id="_x0000_i1049" style="width:0;height:1.5pt" o:hralign="center" o:hrstd="t" o:hr="t" fillcolor="#a0a0a0" stroked="f"/>
         </w:pict>
       </w:r>
     </w:p>
@@ -2833,48 +1951,7 @@
           <w:lang w:val="en-IN"/>
         </w:rPr>
         <w:br/>
-      </w:r>
-      <w:proofErr w:type="spellStart"/>
-      <w:r>
-        <w:rPr>
-          <w:lang w:val="en-IN"/>
-        </w:rPr>
-        <w:t>sales_</w:t>
-      </w:r>
-      <w:proofErr w:type="gramStart"/>
-      <w:r>
-        <w:rPr>
-          <w:lang w:val="en-IN"/>
-        </w:rPr>
-        <w:t>data</w:t>
-      </w:r>
-      <w:proofErr w:type="spellEnd"/>
-      <w:r>
-        <w:rPr>
-          <w:lang w:val="en-IN"/>
-        </w:rPr>
-        <w:t>(</w:t>
-      </w:r>
-      <w:proofErr w:type="gramEnd"/>
-      <w:r>
-        <w:rPr>
-          <w:lang w:val="en-IN"/>
-        </w:rPr>
-        <w:t xml:space="preserve">id INT, region STRING, revenue FLOAT, </w:t>
-      </w:r>
-      <w:proofErr w:type="spellStart"/>
-      <w:r>
-        <w:rPr>
-          <w:lang w:val="en-IN"/>
-        </w:rPr>
-        <w:t>sale_date</w:t>
-      </w:r>
-      <w:proofErr w:type="spellEnd"/>
-      <w:r>
-        <w:rPr>
-          <w:lang w:val="en-IN"/>
-        </w:rPr>
-        <w:t xml:space="preserve"> DATE)</w:t>
+        <w:t>sales_data(id INT, region STRING, revenue FLOAT, sale_date DATE)</w:t>
       </w:r>
       <w:r>
         <w:rPr>
@@ -2929,7 +2006,7 @@
           <w:lang w:val="en-IN"/>
         </w:rPr>
         <w:pict w14:anchorId="47CB79D9">
-          <v:rect id="_x0000_i1248" style="width:0;height:1.5pt" o:hralign="center" o:hrstd="t" o:hr="t" fillcolor="#a0a0a0" stroked="f"/>
+          <v:rect id="_x0000_i1050" style="width:0;height:1.5pt" o:hralign="center" o:hrstd="t" o:hr="t" fillcolor="#a0a0a0" stroked="f"/>
         </w:pict>
       </w:r>
     </w:p>
@@ -2960,21 +2037,7 @@
         <w:rPr>
           <w:lang w:val="en-IN"/>
         </w:rPr>
-        <w:t xml:space="preserve">Right </w:t>
-      </w:r>
-      <w:proofErr w:type="gramStart"/>
-      <w:r>
-        <w:rPr>
-          <w:lang w:val="en-IN"/>
-        </w:rPr>
-        <w:t>now</w:t>
-      </w:r>
-      <w:proofErr w:type="gramEnd"/>
-      <w:r>
-        <w:rPr>
-          <w:lang w:val="en-IN"/>
-        </w:rPr>
-        <w:t xml:space="preserve"> LLM always generates SQL.</w:t>
+        <w:t>Right now LLM always generates SQL.</w:t>
       </w:r>
     </w:p>
     <w:p>
@@ -3000,29 +2063,7 @@
         <w:rPr>
           <w:lang w:val="en-IN"/>
         </w:rPr>
-        <w:t xml:space="preserve">if "count" in </w:t>
-      </w:r>
-      <w:proofErr w:type="spellStart"/>
-      <w:r>
-        <w:rPr>
-          <w:lang w:val="en-IN"/>
-        </w:rPr>
-        <w:t>user_</w:t>
-      </w:r>
-      <w:proofErr w:type="gramStart"/>
-      <w:r>
-        <w:rPr>
-          <w:lang w:val="en-IN"/>
-        </w:rPr>
-        <w:t>input.lower</w:t>
-      </w:r>
-      <w:proofErr w:type="spellEnd"/>
-      <w:proofErr w:type="gramEnd"/>
-      <w:r>
-        <w:rPr>
-          <w:lang w:val="en-IN"/>
-        </w:rPr>
-        <w:t>():</w:t>
+        <w:t>if "count" in user_input.lower():</w:t>
       </w:r>
       <w:r>
         <w:rPr>
@@ -3057,7 +2098,7 @@
           <w:lang w:val="en-IN"/>
         </w:rPr>
         <w:pict w14:anchorId="640E4429">
-          <v:rect id="_x0000_i1249" style="width:0;height:1.5pt" o:hralign="center" o:hrstd="t" o:hr="t" fillcolor="#a0a0a0" stroked="f"/>
+          <v:rect id="_x0000_i1051" style="width:0;height:1.5pt" o:hralign="center" o:hrstd="t" o:hr="t" fillcolor="#a0a0a0" stroked="f"/>
         </w:pict>
       </w:r>
     </w:p>
@@ -3084,103 +2125,25 @@
           <w:lang w:val="en-IN"/>
         </w:rPr>
       </w:pPr>
-      <w:proofErr w:type="gramStart"/>
-      <w:r>
-        <w:rPr>
-          <w:lang w:val="en-IN"/>
-        </w:rPr>
-        <w:t>print(</w:t>
-      </w:r>
-      <w:proofErr w:type="gramEnd"/>
-      <w:r>
-        <w:rPr>
-          <w:lang w:val="en-IN"/>
-        </w:rPr>
-        <w:t xml:space="preserve">"User:", </w:t>
-      </w:r>
-      <w:proofErr w:type="spellStart"/>
-      <w:r>
-        <w:rPr>
-          <w:lang w:val="en-IN"/>
-        </w:rPr>
-        <w:t>user_input</w:t>
-      </w:r>
-      <w:proofErr w:type="spellEnd"/>
-      <w:r>
-        <w:rPr>
-          <w:lang w:val="en-IN"/>
-        </w:rPr>
-        <w:t>)</w:t>
-      </w:r>
-      <w:r>
-        <w:rPr>
-          <w:lang w:val="en-IN"/>
-        </w:rPr>
-        <w:br/>
-      </w:r>
-      <w:proofErr w:type="gramStart"/>
-      <w:r>
-        <w:rPr>
-          <w:lang w:val="en-IN"/>
-        </w:rPr>
-        <w:t>print(</w:t>
-      </w:r>
-      <w:proofErr w:type="gramEnd"/>
-      <w:r>
-        <w:rPr>
-          <w:lang w:val="en-IN"/>
-        </w:rPr>
-        <w:t xml:space="preserve">"SQL:", </w:t>
-      </w:r>
-      <w:proofErr w:type="spellStart"/>
-      <w:r>
-        <w:rPr>
-          <w:lang w:val="en-IN"/>
-        </w:rPr>
-        <w:t>sql_query</w:t>
-      </w:r>
-      <w:proofErr w:type="spellEnd"/>
-      <w:r>
-        <w:rPr>
-          <w:lang w:val="en-IN"/>
-        </w:rPr>
-        <w:t>)</w:t>
-      </w:r>
-      <w:r>
-        <w:rPr>
-          <w:lang w:val="en-IN"/>
-        </w:rPr>
-        <w:br/>
-      </w:r>
-      <w:proofErr w:type="gramStart"/>
-      <w:r>
-        <w:rPr>
-          <w:lang w:val="en-IN"/>
-        </w:rPr>
-        <w:t>print(</w:t>
-      </w:r>
-      <w:proofErr w:type="gramEnd"/>
-      <w:r>
-        <w:rPr>
-          <w:lang w:val="en-IN"/>
-        </w:rPr>
-        <w:t xml:space="preserve">"Output:", </w:t>
-      </w:r>
-      <w:proofErr w:type="spellStart"/>
-      <w:proofErr w:type="gramStart"/>
-      <w:r>
-        <w:rPr>
-          <w:lang w:val="en-IN"/>
-        </w:rPr>
-        <w:t>response.json</w:t>
-      </w:r>
-      <w:proofErr w:type="spellEnd"/>
-      <w:proofErr w:type="gramEnd"/>
-      <w:r>
-        <w:rPr>
-          <w:lang w:val="en-IN"/>
-        </w:rPr>
-        <w:t>())</w:t>
+      <w:r>
+        <w:rPr>
+          <w:lang w:val="en-IN"/>
+        </w:rPr>
+        <w:t>print("User:", user_input)</w:t>
+      </w:r>
+      <w:r>
+        <w:rPr>
+          <w:lang w:val="en-IN"/>
+        </w:rPr>
+        <w:br/>
+        <w:t>print("SQL:", sql_query)</w:t>
+      </w:r>
+      <w:r>
+        <w:rPr>
+          <w:lang w:val="en-IN"/>
+        </w:rPr>
+        <w:br/>
+        <w:t>print("Output:", response.json())</w:t>
       </w:r>
     </w:p>
     <w:p>
@@ -3194,7 +2157,7 @@
           <w:lang w:val="en-IN"/>
         </w:rPr>
         <w:pict w14:anchorId="1259B9EE">
-          <v:rect id="_x0000_i1250" style="width:0;height:1.5pt" o:hralign="center" o:hrstd="t" o:hr="t" fillcolor="#a0a0a0" stroked="f"/>
+          <v:rect id="_x0000_i1052" style="width:0;height:1.5pt" o:hralign="center" o:hrstd="t" o:hr="t" fillcolor="#a0a0a0" stroked="f"/>
         </w:pict>
       </w:r>
     </w:p>

</xml_diff>